<commit_message>
Add architecture and schema diagrams to docs
</commit_message>
<xml_diff>
--- a/docs/final_report_paper.docx
+++ b/docs/final_report_paper.docx
@@ -475,6 +475,48 @@
     </w:p>
     <w:p>
       <w:pPr>
+        <w:pStyle w:val="Heading2"/>
+      </w:pPr>
+      <w:r>
+        <w:t>5.1 End-to-end processing flow</w:t>
+      </w:r>
+    </w:p>
+    <w:p>
+      <w:r>
+        <w:t>The full workflow can also be viewed as a sequence of engineering steps.</w:t>
+      </w:r>
+    </w:p>
+    <w:p>
+      <w:pPr>
+        <w:pStyle w:val="IntenseQuote"/>
+      </w:pPr>
+      <w:r>
+        <w:t>Architecture diagram is represented in the repository source and accompanying dashboard materials.</w:t>
+      </w:r>
+    </w:p>
+    <w:p>
+      <w:pPr>
+        <w:pStyle w:val="Heading2"/>
+      </w:pPr>
+      <w:r>
+        <w:t>5.2 Repository structure</w:t>
+      </w:r>
+    </w:p>
+    <w:p>
+      <w:r>
+        <w:t>The project layout is intentionally simple so teammates can understand where each part belongs.</w:t>
+      </w:r>
+    </w:p>
+    <w:p>
+      <w:pPr>
+        <w:pStyle w:val="IntenseQuote"/>
+      </w:pPr>
+      <w:r>
+        <w:t>Architecture diagram is represented in the repository source and accompanying dashboard materials.</w:t>
+      </w:r>
+    </w:p>
+    <w:p>
+      <w:pPr>
         <w:pStyle w:val="Heading1"/>
       </w:pPr>
       <w:r>
@@ -588,6 +630,22 @@
     </w:p>
     <w:p>
       <w:pPr>
+        <w:pStyle w:val="Heading2"/>
+      </w:pPr>
+      <w:r>
+        <w:t>6.1 Raw source organization</w:t>
+      </w:r>
+    </w:p>
+    <w:p>
+      <w:pPr>
+        <w:pStyle w:val="IntenseQuote"/>
+      </w:pPr>
+      <w:r>
+        <w:t>Architecture diagram is represented in the repository source and accompanying dashboard materials.</w:t>
+      </w:r>
+    </w:p>
+    <w:p>
+      <w:pPr>
         <w:pStyle w:val="Heading1"/>
       </w:pPr>
       <w:r>
@@ -850,6 +908,22 @@
         <w:pStyle w:val="Heading2"/>
       </w:pPr>
       <w:r>
+        <w:t>7.5 ETL step diagram</w:t>
+      </w:r>
+    </w:p>
+    <w:p>
+      <w:pPr>
+        <w:pStyle w:val="IntenseQuote"/>
+      </w:pPr>
+      <w:r>
+        <w:t>Architecture diagram is represented in the repository source and accompanying dashboard materials.</w:t>
+      </w:r>
+    </w:p>
+    <w:p>
+      <w:pPr>
+        <w:pStyle w:val="Heading2"/>
+      </w:pPr>
+      <w:r>
         <w:t>7.4 Data quality rules</w:t>
       </w:r>
     </w:p>
@@ -991,6 +1065,22 @@
     <w:p>
       <w:r>
         <w:t>This table is what powers the dashboard and most of the analysis in the report.</w:t>
+      </w:r>
+    </w:p>
+    <w:p>
+      <w:pPr>
+        <w:pStyle w:val="Heading2"/>
+      </w:pPr>
+      <w:r>
+        <w:t>8.1 Schema relationship diagram</w:t>
+      </w:r>
+    </w:p>
+    <w:p>
+      <w:pPr>
+        <w:pStyle w:val="IntenseQuote"/>
+      </w:pPr>
+      <w:r>
+        <w:t>Architecture diagram is represented in the repository source and accompanying dashboard materials.</w:t>
       </w:r>
     </w:p>
     <w:p>
@@ -1070,6 +1160,22 @@
     <w:p>
       <w:r>
         <w:t>This makes the project easier to explain in a demo because it connects the warehouse outputs back to user-facing insights.</w:t>
+      </w:r>
+    </w:p>
+    <w:p>
+      <w:pPr>
+        <w:pStyle w:val="Heading2"/>
+      </w:pPr>
+      <w:r>
+        <w:t>9.1 Dashboard data flow</w:t>
+      </w:r>
+    </w:p>
+    <w:p>
+      <w:pPr>
+        <w:pStyle w:val="IntenseQuote"/>
+      </w:pPr>
+      <w:r>
+        <w:t>Architecture diagram is represented in the repository source and accompanying dashboard materials.</w:t>
       </w:r>
     </w:p>
     <w:p>

</xml_diff>